<commit_message>
lam lai bao cao tuan 12 day du hon
Co-Authored-By: Claude Opus 4.8 <noreply@anthropic.com>
</commit_message>
<xml_diff>
--- a/BaoCao/bao-cao-tuan/BaoCao_Tuan12.docx
+++ b/BaoCao/bao-cao-tuan/BaoCao_Tuan12.docx
@@ -152,17 +152,17 @@
           </w:p>
           <w:p>
             <w:r>
-              <w:t>-  Sơ đồ ghế đổi sang dạng thẻ lớn: mỗi ghế hiển thị luôn số điện thoại, tên khách, điểm trả, số tiền và người bán — không phải mở thêm bảng phụ.</w:t>
+              <w:t>-  Sơ đồ ghế đổi sang dạng thẻ lớn: mỗi ghế hiển thị luôn số điện thoại, tên khách, điểm trả, số tiền và người bán ngay trên ô.</w:t>
             </w:r>
           </w:p>
           <w:p>
             <w:r>
-              <w:t>-  Bỏ dải nút số nhỏ bị trùng lặp phía trên và làm gọn tiêu đề các mục cho sáng sủa, dễ nhìn.</w:t>
+              <w:t>-  Bỏ dải nút số nhỏ bị trùng lặp, làm gọn tiêu đề các mục, thanh tiến độ thu tiền dễ nhìn.</w:t>
             </w:r>
           </w:p>
           <w:p>
             <w:r>
-              <w:t>-  Hiệu quả: nhân viên nhìn một màn hình thấy đủ thông tin từng ghế, thao tác nhanh và quen tay như phần mềm phổ biến trên thị trường.</w:t>
+              <w:t>-  Hiệu quả: nhân viên thấy đủ thông tin từng ghế trên một màn hình, thao tác nhanh và quen tay như phần mềm phổ biến trên thị trường.</w:t>
             </w:r>
           </w:p>
           <w:p>
@@ -175,17 +175,17 @@
           </w:p>
           <w:p>
             <w:r>
-              <w:t>-  Thanh thông tin chuyến trước đây báo "Tiền đã thu/Tổng: NaN" và "Còn lại: NaN" do dữ liệu tiền trả về dạng chữ nên cộng sai.</w:t>
+              <w:t>-  Thanh thông tin chuyến trước đây báo "Tiền đã thu/Tổng: NaN" và "Còn lại: NaN" do dữ liệu tiền trả về dạng chữ.</w:t>
             </w:r>
           </w:p>
           <w:p>
             <w:r>
-              <w:t>-  Đã ép dữ liệu về dạng số, hiển thị đúng số tiền đã thu, tổng tiền và số còn lại của cả chuyến.</w:t>
+              <w:t>-  Đã ép về dạng số, hiển thị đúng đã thu / tổng tiền / còn lại của cả chuyến.</w:t>
             </w:r>
           </w:p>
           <w:p>
             <w:r>
-              <w:t>-  Hiệu quả: nhân viên và điều hành biết chính xác tiền đã thu và còn thiếu của mỗi chuyến, tránh nhầm lẫn khi đối soát cuối ngày.</w:t>
+              <w:t>-  Hiệu quả: đối soát tiền mỗi chuyến chính xác, tránh nhầm lẫn cuối ngày.</w:t>
             </w:r>
           </w:p>
           <w:p>
@@ -198,17 +198,12 @@
           </w:p>
           <w:p>
             <w:r>
-              <w:t>-  Mỗi khung giờ có một thanh tự đầy theo số ghế đã bán; trước đây là vạch dọc mảnh bên hông, khó thấy.</w:t>
+              <w:t>-  Đổi từ vạch dọc mảnh khó thấy sang thanh ngang to ở đáy khung giờ; màu xám (còn trống) sang xanh (có khách) và xanh lá (đầy xe).</w:t>
             </w:r>
           </w:p>
           <w:p>
             <w:r>
-              <w:t>-  Đã đổi sang thanh ngang to ở đáy khung giờ, đổi màu xám (còn trống) sang xanh dương (có khách) và xanh lá (đầy xe).</w:t>
-            </w:r>
-          </w:p>
-          <w:p>
-            <w:r>
-              <w:t>-  Hiệu quả: liếc qua là biết ngay chuyến nào sắp đầy, chuyến nào còn nhiều chỗ để điều phối khách và tăng/giảm xe hợp lý.</w:t>
+              <w:t>-  Hiệu quả: liếc qua là biết ngay chuyến nào sắp đầy, chuyến nào còn nhiều chỗ để điều phối khách hợp lý.</w:t>
             </w:r>
           </w:p>
           <w:p>
@@ -216,17 +211,63 @@
               <w:rPr>
                 <w:b/>
               </w:rPr>
-              <w:t>Rà soát, đối chiếu với phần mềm mẫu để tinh chỉnh</w:t>
+              <w:t>Gộp quản lý "trạm đón dọc đường" và "từ viết tắt" về một nơi</w:t>
             </w:r>
           </w:p>
           <w:p>
             <w:r>
-              <w:t>-  Đối chiếu bố cục màn hình bán vé với phần mềm quản lý nhà xe đang phổ biến, chỉnh cho gần giống và thuận tay hơn.</w:t>
+              <w:t>-  Trước đây có hai bảng dữ liệu và hai trang quản lý riêng (bên đặt vé online và bên Tổng Hợp) nên dễ lệch nhau.</w:t>
             </w:r>
           </w:p>
           <w:p>
             <w:r>
-              <w:t>-  Hiệu quả: giao diện quen thuộc với người từng dùng phần mềm khác, giảm thời gian đào tạo và làm quen cho nhân viên mới.</w:t>
+              <w:t>-  Đã gộp về một nguồn dữ liệu duy nhất, quản lý trong một trang trên Tổng Hợp: thêm/sửa/xóa trạm, bí danh viết tắt, bật/tắt trạm, đảo chiều tuyến.</w:t>
+            </w:r>
+          </w:p>
+          <w:p>
+            <w:r>
+              <w:t>-  Hiệu quả: sửa một chỗ áp dụng cho cả đặt vé online lẫn tự động tạo đơn hàng dọc đường — không còn lệch dữ liệu, dễ quản lý.</w:t>
+            </w:r>
+          </w:p>
+          <w:p>
+            <w:r>
+              <w:rPr>
+                <w:b/>
+              </w:rPr>
+              <w:t>Nhập Hàng: sau 2 phút chỉ khoá giá tiền, thông tin khác vẫn sửa được</w:t>
+            </w:r>
+          </w:p>
+          <w:p>
+            <w:r>
+              <w:t>-  Trước đây quá 2 phút kể từ lúc tạo đơn là khoá sửa toàn bộ đơn.</w:t>
+            </w:r>
+          </w:p>
+          <w:p>
+            <w:r>
+              <w:t>-  Nay chỉ khoá riêng ô giá tiền (tránh sửa nhầm/gian lận giá); tên, số điện thoại, trạm nhận, loại hàng, xe... vẫn cho sửa.</w:t>
+            </w:r>
+          </w:p>
+          <w:p>
+            <w:r>
+              <w:t>-  Hiệu quả: nhân viên vẫn chỉnh được thông tin giao nhận cho đơn cũ, trong khi giá tiền được bảo vệ.</w:t>
+            </w:r>
+          </w:p>
+          <w:p>
+            <w:r>
+              <w:rPr>
+                <w:b/>
+              </w:rPr>
+              <w:t>Đồng bộ dữ liệu O2BSoft sang Nhập Hàng chạy nền ổn định</w:t>
+            </w:r>
+          </w:p>
+          <w:p>
+            <w:r>
+              <w:t>-  Công cụ đồng bộ tự chạy ngay cả khi chuyển sang tab khác (không bị trình duyệt làm chậm), tự bật sẵn và tự đăng nhập lại khi rớt phiên.</w:t>
+            </w:r>
+          </w:p>
+          <w:p>
+            <w:r>
+              <w:t>-  Hiệu quả: đơn hàng từ O2BSoft tự chảy về hệ thống liên tục, nhân viên An Đông không phải bấm đồng bộ hay nhập tay lại.</w:t>
             </w:r>
           </w:p>
         </w:tc>

</xml_diff>